<commit_message>
Fix leftover red placeholder text and Pernyataan II PPL overflowing to 2 pages
- All ${...} merge fields that were still colored red (FF0000, inherited
  from the original template's example-highlight styling) are now black,
  across all 4 Termin 2 templates (Pernyataan PPL/PML, BAST PPL/PML).
- Surat Pernyataan Termin II PPL overflowed by one line onto a 2nd page
  once real (longer) SPK numbers and target/realisasi figures replaced the
  short "..."/"…" placeholder text the original template was tuned for.
  Trimmed top/bottom margins slightly (1440/900 -> 900/720 twips) and
  removed the height of a trailing empty paragraph - verified 1 page with
  realistic data. PML's Pernyataan and both BAST templates are unaffected
  (they were already multi-page in the original due to lampiran tables).

Co-Authored-By: Claude Sonnet 5 <noreply@anthropic.com>
</commit_message>
<xml_diff>
--- a/static/templates-se2026/bast_termin2_pml_se2026.docx
+++ b/static/templates-se2026/bast_termin2_pml_se2026.docx
@@ -170,7 +170,7 @@
       <w:r>
         <w:rPr>
           <w:rFonts w:eastAsia="Bookman Old Style" w:cs="Bookman Old Style" w:ascii="Bookman Old Style" w:hAnsi="Bookman Old Style"/>
-          <w:color w:val="FF0000"/>
+          <w:color w:val="000000"/>
           <w:sz w:val="24"/>
           <w:szCs w:val="24"/>
         </w:rPr>
@@ -550,7 +550,7 @@
       <w:r>
         <w:rPr>
           <w:rFonts w:eastAsia="Bookman Old Style" w:cs="Bookman Old Style" w:ascii="Bookman Old Style" w:hAnsi="Bookman Old Style"/>
-          <w:color w:val="FF0000"/>
+          <w:color w:val="000000"/>
           <w:sz w:val="24"/>
           <w:szCs w:val="24"/>
         </w:rPr>
@@ -708,7 +708,7 @@
       <w:r>
         <w:rPr>
           <w:rFonts w:eastAsia="Bookman Old Style" w:cs="Bookman Old Style" w:ascii="Bookman Old Style" w:hAnsi="Bookman Old Style"/>
-          <w:color w:val="FF0000"/>
+          <w:color w:val="000000"/>
           <w:sz w:val="24"/>
           <w:szCs w:val="24"/>
         </w:rPr>
@@ -2075,15 +2075,15 @@
               <w:jc w:val="center"/>
               <w:rPr>
                 <w:rFonts w:ascii="Bookman Old Style" w:hAnsi="Bookman Old Style" w:eastAsia="Bookman Old Style" w:cs="Bookman Old Style"/>
-                <w:color w:val="FF0000"/>
-                <w:sz w:val="24"/>
-                <w:szCs w:val="24"/>
-              </w:rPr>
-            </w:pPr>
-            <w:r>
-              <w:rPr>
-                <w:rFonts w:eastAsia="Bookman Old Style" w:cs="Bookman Old Style" w:ascii="Bookman Old Style" w:hAnsi="Bookman Old Style"/>
-                <w:color w:val="FF0000"/>
+                <w:color w:val="000000"/>
+                <w:sz w:val="24"/>
+                <w:szCs w:val="24"/>
+              </w:rPr>
+            </w:pPr>
+            <w:r>
+              <w:rPr>
+                <w:rFonts w:eastAsia="Bookman Old Style" w:cs="Bookman Old Style" w:ascii="Bookman Old Style" w:hAnsi="Bookman Old Style"/>
+                <w:color w:val="000000"/>
                 <w:sz w:val="24"/>
                 <w:szCs w:val="24"/>
               </w:rPr>
@@ -2094,7 +2094,7 @@
                 <w:rFonts w:eastAsia="Bookman Old Style" w:cs="Bookman Old Style" w:ascii="Bookman Old Style" w:hAnsi="Bookman Old Style"/>
                 <w:i/>
                 <w:iCs/>
-                <w:color w:val="FF0000"/>
+                <w:color w:val="000000"/>
                 <w:sz w:val="24"/>
                 <w:szCs w:val="24"/>
               </w:rPr>
@@ -2103,7 +2103,7 @@
             <w:r>
               <w:rPr>
                 <w:rFonts w:eastAsia="Bookman Old Style" w:cs="Bookman Old Style" w:ascii="Bookman Old Style" w:hAnsi="Bookman Old Style"/>
-                <w:color w:val="FF0000"/>
+                <w:color w:val="000000"/>
                 <w:sz w:val="24"/>
                 <w:szCs w:val="24"/>
               </w:rPr>
@@ -2778,15 +2778,15 @@
         <w:jc w:val="center"/>
         <w:rPr>
           <w:rFonts w:ascii="Bookman Old Style" w:hAnsi="Bookman Old Style" w:eastAsia="Bookman Old Style" w:cs="Bookman Old Style"/>
-          <w:color w:val="FF0000"/>
-          <w:sz w:val="24"/>
-          <w:szCs w:val="24"/>
-        </w:rPr>
-      </w:pPr>
-      <w:r>
-        <w:rPr>
-          <w:rFonts w:eastAsia="Bookman Old Style" w:cs="Bookman Old Style" w:ascii="Bookman Old Style" w:hAnsi="Bookman Old Style"/>
-          <w:color w:val="FF0000"/>
+          <w:color w:val="000000"/>
+          <w:sz w:val="24"/>
+          <w:szCs w:val="24"/>
+        </w:rPr>
+      </w:pPr>
+      <w:r>
+        <w:rPr>
+          <w:rFonts w:eastAsia="Bookman Old Style" w:cs="Bookman Old Style" w:ascii="Bookman Old Style" w:hAnsi="Bookman Old Style"/>
+          <w:color w:val="000000"/>
           <w:sz w:val="24"/>
           <w:szCs w:val="24"/>
         </w:rPr>
@@ -2799,15 +2799,15 @@
         <w:jc w:val="center"/>
         <w:rPr>
           <w:rFonts w:ascii="Bookman Old Style" w:hAnsi="Bookman Old Style" w:eastAsia="Bookman Old Style" w:cs="Bookman Old Style"/>
-          <w:color w:val="FF0000"/>
-          <w:sz w:val="24"/>
-          <w:szCs w:val="24"/>
-        </w:rPr>
-      </w:pPr>
-      <w:r>
-        <w:rPr>
-          <w:rFonts w:eastAsia="Bookman Old Style" w:cs="Bookman Old Style" w:ascii="Bookman Old Style" w:hAnsi="Bookman Old Style"/>
-          <w:color w:val="FF0000"/>
+          <w:color w:val="000000"/>
+          <w:sz w:val="24"/>
+          <w:szCs w:val="24"/>
+        </w:rPr>
+      </w:pPr>
+      <w:r>
+        <w:rPr>
+          <w:rFonts w:eastAsia="Bookman Old Style" w:cs="Bookman Old Style" w:ascii="Bookman Old Style" w:hAnsi="Bookman Old Style"/>
+          <w:color w:val="000000"/>
           <w:sz w:val="24"/>
           <w:szCs w:val="24"/>
         </w:rPr>
@@ -2821,15 +2821,15 @@
         <w:jc w:val="center"/>
         <w:rPr>
           <w:rFonts w:ascii="Bookman Old Style" w:hAnsi="Bookman Old Style" w:eastAsia="Bookman Old Style" w:cs="Bookman Old Style"/>
-          <w:color w:val="FF0000"/>
-          <w:sz w:val="24"/>
-          <w:szCs w:val="24"/>
-        </w:rPr>
-      </w:pPr>
-      <w:r>
-        <w:rPr>
-          <w:rFonts w:eastAsia="Bookman Old Style" w:cs="Bookman Old Style" w:ascii="Bookman Old Style" w:hAnsi="Bookman Old Style"/>
-          <w:color w:val="FF0000"/>
+          <w:color w:val="000000"/>
+          <w:sz w:val="24"/>
+          <w:szCs w:val="24"/>
+        </w:rPr>
+      </w:pPr>
+      <w:r>
+        <w:rPr>
+          <w:rFonts w:eastAsia="Bookman Old Style" w:cs="Bookman Old Style" w:ascii="Bookman Old Style" w:hAnsi="Bookman Old Style"/>
+          <w:color w:val="000000"/>
           <w:sz w:val="24"/>
           <w:szCs w:val="24"/>
         </w:rPr>

</xml_diff>

<commit_message>
Fix missing space in BAST point 1 (and others) from fragmented \${...} runs
LibreOffice's UNO save split \${nomor_spk} across two runs ("\${n" + "omor_spk}...").
replaceInDocx's cleanXMLSplitPlaceholders merges split placeholders by
flattening the matched span to plain text, which drops the xml:space="preserve"
attribute that was on the second run - so the trailing space after "sebesar"
got collapsed by the renderer, producing "sebesar7". Merged these fragmented
runs back into single well-formed runs with xml:space="preserve" in both
BAST templates (3 each; the two Pernyataan templates had none).

Co-Authored-By: Claude Sonnet 5 <noreply@anthropic.com>
</commit_message>
<xml_diff>
--- a/static/templates-se2026/bast_termin2_pml_se2026.docx
+++ b/static/templates-se2026/bast_termin2_pml_se2026.docx
@@ -174,16 +174,7 @@
           <w:sz w:val="24"/>
           <w:szCs w:val="24"/>
         </w:rPr>
-        <w:t>${no</w:t>
-      </w:r>
-      <w:r>
-        <w:rPr>
-          <w:rFonts w:eastAsia="Bookman Old Style" w:cs="Bookman Old Style" w:ascii="Bookman Old Style" w:hAnsi="Bookman Old Style"/>
-          <w:color w:val="000000"/>
-          <w:sz w:val="24"/>
-          <w:szCs w:val="24"/>
-        </w:rPr>
-        <w:t>mor_spk}, bertempat di Kelurahan Bada, Kecamatan Dompu, kami yang bertanda tangan di bawah ini:</w:t>
+        <w:t xml:space="preserve">${nomor_spk}, bertempat di Kelurahan Bada, Kecamatan Dompu, kami yang bertanda tangan di bawah ini:</w:t>
       </w:r>
     </w:p>
     <w:p>
@@ -542,19 +533,11 @@
       <w:r>
         <w:rPr>
           <w:rFonts w:eastAsia="Bookman Old Style" w:cs="Bookman Old Style" w:ascii="Bookman Old Style" w:hAnsi="Bookman Old Style"/>
-          <w:sz w:val="24"/>
-          <w:szCs w:val="24"/>
-        </w:rPr>
-        <w:t xml:space="preserve"> telah melaksanakan seluruh pekerjaan Pemeriksaan Pendataan Lapangan Sensus Ekonomi 2026 pada Badan Pusat Statistik Kabupaten Dompu berdasarkan Perjanjian Kerja Nomor: ${nomor_spk}, sesuai dengan target pekerjaan yang ditetapkan sebesar ${</w:t>
-      </w:r>
-      <w:r>
-        <w:rPr>
-          <w:rFonts w:eastAsia="Bookman Old Style" w:cs="Bookman Old Style" w:ascii="Bookman Old Style" w:hAnsi="Bookman Old Style"/>
           <w:color w:val="000000"/>
           <w:sz w:val="24"/>
           <w:szCs w:val="24"/>
         </w:rPr>
-        <w:t>target_sls} SLS/Sub-SLS dan/atau</w:t>
+        <w:t xml:space="preserve"> telah melaksanakan seluruh pekerjaan Pemeriksaan Pendataan Lapangan Sensus Ekonomi 2026 pada Badan Pusat Statistik Kabupaten Dompu berdasarkan Perjanjian Kerja Nomor: ${nomor_spk}, sesuai dengan target pekerjaan yang ditetapkan sebesar ${target_sls} SLS/Sub-SLS dan/atau</w:t>
       </w:r>
       <w:r>
         <w:rPr>
@@ -700,19 +683,11 @@
       <w:r>
         <w:rPr>
           <w:rFonts w:eastAsia="Bookman Old Style" w:cs="Bookman Old Style" w:ascii="Bookman Old Style" w:hAnsi="Bookman Old Style"/>
-          <w:sz w:val="24"/>
-          <w:szCs w:val="24"/>
-        </w:rPr>
-        <w:t>Pekerjaan Pemeriksaan Pendataan Lapangan Sensus Ekonomi 2026 sebagaimana dimaksud dalam angka 3, berupa dokumen pemeriksaan hasil Pendataan Lapangan Sensus Ekonomi 2026, sejumlah ${ta</w:t>
-      </w:r>
-      <w:r>
-        <w:rPr>
-          <w:rFonts w:eastAsia="Bookman Old Style" w:cs="Bookman Old Style" w:ascii="Bookman Old Style" w:hAnsi="Bookman Old Style"/>
           <w:color w:val="000000"/>
           <w:sz w:val="24"/>
           <w:szCs w:val="24"/>
         </w:rPr>
-        <w:t>rget_sls} SLS/Sub-SLS dan/atau usaha besar</w:t>
+        <w:t xml:space="preserve">Pekerjaan Pemeriksaan Pendataan Lapangan Sensus Ekonomi 2026 sebagaimana dimaksud dalam angka 3, berupa dokumen pemeriksaan hasil Pendataan Lapangan Sensus Ekonomi 2026, sejumlah ${target_sls} SLS/Sub-SLS dan/atau usaha besar</w:t>
       </w:r>
       <w:r>
         <w:rPr>

</xml_diff>